<commit_message>
spike report 17 done
</commit_message>
<xml_diff>
--- a/17 - Spike - Sprites and Graphics/Task 17 - Lab Spike Report.docx
+++ b/17 - Spike - Sprites and Graphics/Task 17 - Lab Spike Report.docx
@@ -200,16 +200,6 @@
         </w:rPr>
         <w:t>report, what else was created?</w:t>
       </w:r>
-    </w:p>
-    <w:p>
-      <w:pPr>
-        <w:spacing w:line="360" w:lineRule="auto"/>
-        <w:rPr>
-          <w:rStyle w:val="SubtleReference"/>
-          <w:sz w:val="24"/>
-          <w:szCs w:val="24"/>
-        </w:rPr>
-      </w:pPr>
     </w:p>
     <w:p>
       <w:pPr>
@@ -441,29 +431,744 @@
     </w:p>
     <w:p>
       <w:pPr>
-        <w:pStyle w:val="ColorfulList-Accent11"/>
-        <w:spacing w:line="360" w:lineRule="auto"/>
-        <w:ind w:left="0"/>
-        <w:rPr>
-          <w:color w:val="5A5A5A" w:themeColor="text1" w:themeTint="A5"/>
+        <w:spacing w:line="360" w:lineRule="auto"/>
+        <w:rPr>
+          <w:b/>
+          <w:sz w:val="24"/>
+        </w:rPr>
+      </w:pPr>
+    </w:p>
+    <w:p>
+      <w:pPr>
+        <w:spacing w:line="360" w:lineRule="auto"/>
+        <w:rPr>
+          <w:b/>
+          <w:bCs/>
+          <w:color w:val="767171" w:themeColor="background2" w:themeShade="80"/>
           <w:sz w:val="28"/>
           <w:szCs w:val="28"/>
-        </w:rPr>
-      </w:pPr>
+          <w:lang w:val="en-US"/>
+        </w:rPr>
+      </w:pPr>
+      <w:r>
+        <w:rPr>
+          <w:b/>
+          <w:bCs/>
+          <w:color w:val="767171" w:themeColor="background2" w:themeShade="80"/>
+          <w:sz w:val="28"/>
+          <w:szCs w:val="28"/>
+          <w:lang w:val="en-US"/>
+        </w:rPr>
+        <w:t>Initialization and Image Loading</w:t>
+      </w:r>
+      <w:r>
+        <w:rPr>
+          <w:b/>
+          <w:color w:val="767171" w:themeColor="background2" w:themeShade="80"/>
+          <w:sz w:val="28"/>
+          <w:szCs w:val="28"/>
+        </w:rPr>
+        <w:t xml:space="preserve">: </w:t>
+      </w:r>
     </w:p>
     <w:p>
       <w:pPr>
         <w:spacing w:line="360" w:lineRule="auto"/>
         <w:jc w:val="both"/>
         <w:rPr>
+          <w:bCs/>
+          <w:color w:val="000000" w:themeColor="text1"/>
+          <w:sz w:val="24"/>
+        </w:rPr>
+      </w:pPr>
+      <w:r>
+        <w:rPr>
+          <w:bCs/>
+          <w:color w:val="000000" w:themeColor="text1"/>
+          <w:sz w:val="24"/>
+        </w:rPr>
+        <w:t xml:space="preserve">To begin the implementation, SDL's video subsystem was initialized with </w:t>
+      </w:r>
+      <w:proofErr w:type="spellStart"/>
+      <w:r>
+        <w:rPr>
+          <w:bCs/>
+          <w:color w:val="000000" w:themeColor="text1"/>
+          <w:sz w:val="24"/>
+        </w:rPr>
+        <w:t>SDL_</w:t>
+      </w:r>
+      <w:proofErr w:type="gramStart"/>
+      <w:r>
+        <w:rPr>
+          <w:bCs/>
+          <w:color w:val="000000" w:themeColor="text1"/>
+          <w:sz w:val="24"/>
+        </w:rPr>
+        <w:t>Init</w:t>
+      </w:r>
+      <w:proofErr w:type="spellEnd"/>
+      <w:r>
+        <w:rPr>
+          <w:bCs/>
+          <w:color w:val="000000" w:themeColor="text1"/>
+          <w:sz w:val="24"/>
+        </w:rPr>
+        <w:t>(</w:t>
+      </w:r>
+      <w:proofErr w:type="gramEnd"/>
+      <w:r>
+        <w:rPr>
+          <w:bCs/>
+          <w:color w:val="000000" w:themeColor="text1"/>
+          <w:sz w:val="24"/>
+        </w:rPr>
+        <w:t xml:space="preserve">SDL_INIT_VIDEO). This is a fundamental step as it prepares SDL for any graphics-related functionality. </w:t>
+      </w:r>
+    </w:p>
+    <w:p>
+      <w:pPr>
+        <w:spacing w:line="360" w:lineRule="auto"/>
+        <w:jc w:val="both"/>
+        <w:rPr>
+          <w:bCs/>
+          <w:color w:val="000000" w:themeColor="text1"/>
+          <w:sz w:val="24"/>
+        </w:rPr>
+      </w:pPr>
+      <w:r>
+        <w:rPr>
+          <w:bCs/>
+          <w:noProof/>
+          <w:color w:val="000000" w:themeColor="text1"/>
+          <w:sz w:val="24"/>
+        </w:rPr>
+        <w:drawing>
+          <wp:inline distT="0" distB="0" distL="0" distR="0" wp14:anchorId="6CF0864E" wp14:editId="57676B36">
+            <wp:extent cx="3798736" cy="746760"/>
+            <wp:effectExtent l="0" t="0" r="0" b="0"/>
+            <wp:docPr id="487522847" name="Picture 1"/>
+            <wp:cNvGraphicFramePr>
+              <a:graphicFrameLocks xmlns:a="http://schemas.openxmlformats.org/drawingml/2006/main" noChangeAspect="1"/>
+            </wp:cNvGraphicFramePr>
+            <a:graphic xmlns:a="http://schemas.openxmlformats.org/drawingml/2006/main">
+              <a:graphicData uri="http://schemas.openxmlformats.org/drawingml/2006/picture">
+                <pic:pic xmlns:pic="http://schemas.openxmlformats.org/drawingml/2006/picture">
+                  <pic:nvPicPr>
+                    <pic:cNvPr id="0" name="Picture 1"/>
+                    <pic:cNvPicPr>
+                      <a:picLocks noChangeAspect="1" noChangeArrowheads="1"/>
+                    </pic:cNvPicPr>
+                  </pic:nvPicPr>
+                  <pic:blipFill rotWithShape="1">
+                    <a:blip r:embed="rId7">
+                      <a:extLst>
+                        <a:ext uri="{28A0092B-C50C-407E-A947-70E740481C1C}">
+                          <a14:useLocalDpi xmlns:a14="http://schemas.microsoft.com/office/drawing/2010/main" val="0"/>
+                        </a:ext>
+                      </a:extLst>
+                    </a:blip>
+                    <a:srcRect l="6484" t="20339" r="5985" b="21187"/>
+                    <a:stretch/>
+                  </pic:blipFill>
+                  <pic:spPr bwMode="auto">
+                    <a:xfrm>
+                      <a:off x="0" y="0"/>
+                      <a:ext cx="3853612" cy="757548"/>
+                    </a:xfrm>
+                    <a:prstGeom prst="rect">
+                      <a:avLst/>
+                    </a:prstGeom>
+                    <a:noFill/>
+                    <a:ln>
+                      <a:noFill/>
+                    </a:ln>
+                    <a:extLst>
+                      <a:ext uri="{53640926-AAD7-44D8-BBD7-CCE9431645EC}">
+                        <a14:shadowObscured xmlns:a14="http://schemas.microsoft.com/office/drawing/2010/main"/>
+                      </a:ext>
+                    </a:extLst>
+                  </pic:spPr>
+                </pic:pic>
+              </a:graphicData>
+            </a:graphic>
+          </wp:inline>
+        </w:drawing>
+      </w:r>
+    </w:p>
+    <w:p>
+      <w:pPr>
+        <w:spacing w:line="360" w:lineRule="auto"/>
+        <w:jc w:val="both"/>
+        <w:rPr>
+          <w:bCs/>
+          <w:color w:val="000000" w:themeColor="text1"/>
+          <w:sz w:val="24"/>
+        </w:rPr>
+      </w:pPr>
+      <w:r>
+        <w:rPr>
+          <w:bCs/>
+          <w:color w:val="000000" w:themeColor="text1"/>
+          <w:sz w:val="24"/>
+        </w:rPr>
+        <w:t xml:space="preserve">Following this, </w:t>
+      </w:r>
+      <w:r>
+        <w:rPr>
+          <w:bCs/>
+          <w:color w:val="000000" w:themeColor="text1"/>
+          <w:sz w:val="24"/>
+        </w:rPr>
+        <w:t>I created a</w:t>
+      </w:r>
+      <w:r>
+        <w:rPr>
+          <w:bCs/>
+          <w:color w:val="000000" w:themeColor="text1"/>
+          <w:sz w:val="24"/>
+        </w:rPr>
+        <w:t xml:space="preserve"> window using </w:t>
+      </w:r>
+      <w:proofErr w:type="spellStart"/>
+      <w:r>
+        <w:rPr>
+          <w:bCs/>
+          <w:color w:val="000000" w:themeColor="text1"/>
+          <w:sz w:val="24"/>
+        </w:rPr>
+        <w:t>SDL_CreateWindow</w:t>
+      </w:r>
+      <w:proofErr w:type="spellEnd"/>
+      <w:r>
+        <w:rPr>
+          <w:bCs/>
+          <w:color w:val="000000" w:themeColor="text1"/>
+          <w:sz w:val="24"/>
+        </w:rPr>
+        <w:t xml:space="preserve">, which </w:t>
+      </w:r>
+      <w:r>
+        <w:rPr>
+          <w:bCs/>
+          <w:color w:val="000000" w:themeColor="text1"/>
+          <w:sz w:val="24"/>
+        </w:rPr>
+        <w:t>gives us</w:t>
+      </w:r>
+      <w:r>
+        <w:rPr>
+          <w:bCs/>
+          <w:color w:val="000000" w:themeColor="text1"/>
+          <w:sz w:val="24"/>
+        </w:rPr>
+        <w:t xml:space="preserve"> a canvas on which graphics, such as images, can be rendered. An associated renderer was initialized using </w:t>
+      </w:r>
+      <w:proofErr w:type="spellStart"/>
+      <w:r>
+        <w:rPr>
+          <w:bCs/>
+          <w:color w:val="000000" w:themeColor="text1"/>
+          <w:sz w:val="24"/>
+        </w:rPr>
+        <w:t>SDL_CreateRenderer</w:t>
+      </w:r>
+      <w:proofErr w:type="spellEnd"/>
+      <w:r>
+        <w:rPr>
+          <w:bCs/>
+          <w:color w:val="000000" w:themeColor="text1"/>
+          <w:sz w:val="24"/>
+        </w:rPr>
+        <w:t>. This renderer is pivotal as it facilitates the rendering of images onto the previously created window.</w:t>
+      </w:r>
+    </w:p>
+    <w:p>
+      <w:pPr>
+        <w:spacing w:line="360" w:lineRule="auto"/>
+        <w:rPr>
           <w:b/>
-          <w:color w:val="000000" w:themeColor="text1"/>
-          <w:sz w:val="24"/>
-        </w:rPr>
-      </w:pPr>
+          <w:bCs/>
+          <w:color w:val="767171" w:themeColor="background2" w:themeShade="80"/>
+          <w:sz w:val="28"/>
+          <w:szCs w:val="28"/>
+          <w:lang w:val="en-US"/>
+        </w:rPr>
+      </w:pPr>
+      <w:r>
+        <w:rPr>
+          <w:b/>
+          <w:bCs/>
+          <w:color w:val="767171" w:themeColor="background2" w:themeShade="80"/>
+          <w:sz w:val="28"/>
+          <w:szCs w:val="28"/>
+          <w:lang w:val="en-US"/>
+        </w:rPr>
+        <w:lastRenderedPageBreak/>
+        <w:t>Displaying and Manipulating Images</w:t>
+      </w:r>
+      <w:r>
+        <w:rPr>
+          <w:b/>
+          <w:color w:val="767171" w:themeColor="background2" w:themeShade="80"/>
+          <w:sz w:val="28"/>
+          <w:szCs w:val="28"/>
+        </w:rPr>
+        <w:t xml:space="preserve">: </w:t>
+      </w:r>
+    </w:p>
+    <w:p>
+      <w:pPr>
+        <w:spacing w:line="360" w:lineRule="auto"/>
+        <w:jc w:val="both"/>
+        <w:rPr>
+          <w:bCs/>
+          <w:color w:val="000000" w:themeColor="text1"/>
+          <w:sz w:val="24"/>
+          <w:lang w:val="en-US"/>
+        </w:rPr>
+      </w:pPr>
+      <w:r>
+        <w:rPr>
+          <w:bCs/>
+          <w:color w:val="000000" w:themeColor="text1"/>
+          <w:sz w:val="24"/>
+          <w:lang w:val="en-US"/>
+        </w:rPr>
+        <w:t xml:space="preserve">Once images are loaded, the next step is rendering them. For the background image, the renderer was used to ensure it occupied the entirety of the window. Additionally, </w:t>
+      </w:r>
+      <w:r>
+        <w:rPr>
+          <w:bCs/>
+          <w:color w:val="000000" w:themeColor="text1"/>
+          <w:sz w:val="24"/>
+          <w:lang w:val="en-US"/>
+        </w:rPr>
+        <w:t>I added a</w:t>
+      </w:r>
+      <w:r>
+        <w:rPr>
+          <w:bCs/>
+          <w:color w:val="000000" w:themeColor="text1"/>
+          <w:sz w:val="24"/>
+          <w:lang w:val="en-US"/>
+        </w:rPr>
+        <w:t xml:space="preserve"> toggle using the “0”, which allows the user to make the background image visible or hidden on command.</w:t>
+      </w:r>
+    </w:p>
+    <w:p>
+      <w:pPr>
+        <w:spacing w:line="360" w:lineRule="auto"/>
+        <w:jc w:val="both"/>
+        <w:rPr>
+          <w:bCs/>
+          <w:noProof/>
+          <w:color w:val="000000" w:themeColor="text1"/>
+          <w:sz w:val="24"/>
+        </w:rPr>
+      </w:pPr>
+    </w:p>
+    <w:p>
+      <w:pPr>
+        <w:spacing w:line="360" w:lineRule="auto"/>
+        <w:jc w:val="both"/>
+        <w:rPr>
+          <w:bCs/>
+          <w:color w:val="000000" w:themeColor="text1"/>
+          <w:sz w:val="24"/>
+        </w:rPr>
+      </w:pPr>
+      <w:r>
+        <w:rPr>
+          <w:bCs/>
+          <w:noProof/>
+          <w:color w:val="000000" w:themeColor="text1"/>
+          <w:sz w:val="24"/>
+        </w:rPr>
+        <w:drawing>
+          <wp:inline distT="0" distB="0" distL="0" distR="0" wp14:anchorId="32E82757" wp14:editId="527DE484">
+            <wp:extent cx="4251960" cy="2743200"/>
+            <wp:effectExtent l="0" t="0" r="0" b="0"/>
+            <wp:docPr id="1771982791" name="Picture 2"/>
+            <wp:cNvGraphicFramePr>
+              <a:graphicFrameLocks xmlns:a="http://schemas.openxmlformats.org/drawingml/2006/main" noChangeAspect="1"/>
+            </wp:cNvGraphicFramePr>
+            <a:graphic xmlns:a="http://schemas.openxmlformats.org/drawingml/2006/main">
+              <a:graphicData uri="http://schemas.openxmlformats.org/drawingml/2006/picture">
+                <pic:pic xmlns:pic="http://schemas.openxmlformats.org/drawingml/2006/picture">
+                  <pic:nvPicPr>
+                    <pic:cNvPr id="0" name="Picture 2"/>
+                    <pic:cNvPicPr>
+                      <a:picLocks noChangeAspect="1" noChangeArrowheads="1"/>
+                    </pic:cNvPicPr>
+                  </pic:nvPicPr>
+                  <pic:blipFill rotWithShape="1">
+                    <a:blip r:embed="rId8">
+                      <a:extLst>
+                        <a:ext uri="{28A0092B-C50C-407E-A947-70E740481C1C}">
+                          <a14:useLocalDpi xmlns:a14="http://schemas.microsoft.com/office/drawing/2010/main" val="0"/>
+                        </a:ext>
+                      </a:extLst>
+                    </a:blip>
+                    <a:srcRect l="14963" t="18662" r="15461" b="17957"/>
+                    <a:stretch/>
+                  </pic:blipFill>
+                  <pic:spPr bwMode="auto">
+                    <a:xfrm>
+                      <a:off x="0" y="0"/>
+                      <a:ext cx="4251960" cy="2743200"/>
+                    </a:xfrm>
+                    <a:prstGeom prst="rect">
+                      <a:avLst/>
+                    </a:prstGeom>
+                    <a:noFill/>
+                    <a:ln>
+                      <a:noFill/>
+                    </a:ln>
+                    <a:extLst>
+                      <a:ext uri="{53640926-AAD7-44D8-BBD7-CCE9431645EC}">
+                        <a14:shadowObscured xmlns:a14="http://schemas.microsoft.com/office/drawing/2010/main"/>
+                      </a:ext>
+                    </a:extLst>
+                  </pic:spPr>
+                </pic:pic>
+              </a:graphicData>
+            </a:graphic>
+          </wp:inline>
+        </w:drawing>
+      </w:r>
+    </w:p>
+    <w:p>
+      <w:pPr>
+        <w:spacing w:line="360" w:lineRule="auto"/>
+        <w:jc w:val="both"/>
+        <w:rPr>
+          <w:bCs/>
+          <w:color w:val="000000" w:themeColor="text1"/>
+          <w:sz w:val="24"/>
+          <w:lang w:val="en-US"/>
+        </w:rPr>
+      </w:pPr>
+      <w:r>
+        <w:rPr>
+          <w:bCs/>
+          <w:color w:val="000000" w:themeColor="text1"/>
+          <w:sz w:val="24"/>
+          <w:lang w:val="en-US"/>
+        </w:rPr>
+        <w:t>U</w:t>
+      </w:r>
+      <w:r>
+        <w:rPr>
+          <w:bCs/>
+          <w:color w:val="000000" w:themeColor="text1"/>
+          <w:sz w:val="24"/>
+          <w:lang w:val="en-US"/>
+        </w:rPr>
+        <w:t xml:space="preserve">sing the </w:t>
+      </w:r>
+      <w:proofErr w:type="spellStart"/>
+      <w:r>
+        <w:rPr>
+          <w:b/>
+          <w:bCs/>
+          <w:color w:val="000000" w:themeColor="text1"/>
+          <w:sz w:val="24"/>
+          <w:lang w:val="en-US"/>
+        </w:rPr>
+        <w:t>SDL_Rect</w:t>
+      </w:r>
+      <w:proofErr w:type="spellEnd"/>
+      <w:r>
+        <w:rPr>
+          <w:bCs/>
+          <w:color w:val="000000" w:themeColor="text1"/>
+          <w:sz w:val="24"/>
+          <w:lang w:val="en-US"/>
+        </w:rPr>
+        <w:t xml:space="preserve"> structure. This structure is integral to defining specific sections of the loaded </w:t>
+      </w:r>
+      <w:proofErr w:type="spellStart"/>
+      <w:r>
+        <w:rPr>
+          <w:bCs/>
+          <w:color w:val="000000" w:themeColor="text1"/>
+          <w:sz w:val="24"/>
+          <w:lang w:val="en-US"/>
+        </w:rPr>
+        <w:t>tileset</w:t>
+      </w:r>
+      <w:proofErr w:type="spellEnd"/>
+      <w:r>
+        <w:rPr>
+          <w:bCs/>
+          <w:color w:val="000000" w:themeColor="text1"/>
+          <w:sz w:val="24"/>
+          <w:lang w:val="en-US"/>
+        </w:rPr>
+        <w:t xml:space="preserve"> image. Each sub-region (or tile) was extracted from the main image and rendered onto the screen at random positions. This rendering was made interactive by allowing users to toggle the visibility of each tile using the number keys. This is evident in the case structures where specific keys correspond to displaying specific tiles.</w:t>
+      </w:r>
+    </w:p>
+    <w:p>
+      <w:pPr>
+        <w:spacing w:line="360" w:lineRule="auto"/>
+        <w:jc w:val="both"/>
+        <w:rPr>
+          <w:bCs/>
+          <w:color w:val="000000" w:themeColor="text1"/>
+          <w:sz w:val="24"/>
+        </w:rPr>
+      </w:pPr>
+    </w:p>
+    <w:p>
+      <w:pPr>
+        <w:spacing w:line="360" w:lineRule="auto"/>
+        <w:rPr>
+          <w:b/>
+          <w:bCs/>
+          <w:color w:val="767171" w:themeColor="background2" w:themeShade="80"/>
+          <w:sz w:val="28"/>
+          <w:szCs w:val="28"/>
+          <w:lang w:val="en-US"/>
+        </w:rPr>
+      </w:pPr>
+      <w:r>
+        <w:rPr>
+          <w:b/>
+          <w:bCs/>
+          <w:color w:val="767171" w:themeColor="background2" w:themeShade="80"/>
+          <w:sz w:val="28"/>
+          <w:szCs w:val="28"/>
+          <w:lang w:val="en-US"/>
+        </w:rPr>
+        <w:t>Debugging</w:t>
+      </w:r>
+      <w:r>
+        <w:rPr>
+          <w:b/>
+          <w:bCs/>
+          <w:color w:val="767171" w:themeColor="background2" w:themeShade="80"/>
+          <w:sz w:val="28"/>
+          <w:szCs w:val="28"/>
+          <w:lang w:val="en-US"/>
+        </w:rPr>
+        <w:t>:</w:t>
+      </w:r>
+      <w:r>
+        <w:rPr>
+          <w:b/>
+          <w:color w:val="767171" w:themeColor="background2" w:themeShade="80"/>
+          <w:sz w:val="28"/>
+          <w:szCs w:val="28"/>
+        </w:rPr>
+        <w:t xml:space="preserve"> </w:t>
+      </w:r>
+    </w:p>
+    <w:p>
+      <w:pPr>
+        <w:spacing w:line="360" w:lineRule="auto"/>
+        <w:jc w:val="both"/>
+        <w:rPr>
+          <w:bCs/>
+          <w:color w:val="000000" w:themeColor="text1"/>
+          <w:sz w:val="24"/>
+        </w:rPr>
+      </w:pPr>
+      <w:r>
+        <w:rPr>
+          <w:bCs/>
+          <w:color w:val="000000" w:themeColor="text1"/>
+          <w:sz w:val="24"/>
+        </w:rPr>
+        <w:drawing>
+          <wp:inline distT="0" distB="0" distL="0" distR="0" wp14:anchorId="3EEBC476" wp14:editId="65993055">
+            <wp:extent cx="6010275" cy="1143000"/>
+            <wp:effectExtent l="0" t="0" r="0" b="0"/>
+            <wp:docPr id="177522516" name="Picture 1" descr="A screenshot of a computer&#10;&#10;Description automatically generated"/>
+            <wp:cNvGraphicFramePr>
+              <a:graphicFrameLocks xmlns:a="http://schemas.openxmlformats.org/drawingml/2006/main" noChangeAspect="1"/>
+            </wp:cNvGraphicFramePr>
+            <a:graphic xmlns:a="http://schemas.openxmlformats.org/drawingml/2006/main">
+              <a:graphicData uri="http://schemas.openxmlformats.org/drawingml/2006/picture">
+                <pic:pic xmlns:pic="http://schemas.openxmlformats.org/drawingml/2006/picture">
+                  <pic:nvPicPr>
+                    <pic:cNvPr id="177522516" name="Picture 1" descr="A screenshot of a computer&#10;&#10;Description automatically generated"/>
+                    <pic:cNvPicPr/>
+                  </pic:nvPicPr>
+                  <pic:blipFill rotWithShape="1">
+                    <a:blip r:embed="rId9"/>
+                    <a:srcRect b="67303"/>
+                    <a:stretch/>
+                  </pic:blipFill>
+                  <pic:spPr bwMode="auto">
+                    <a:xfrm>
+                      <a:off x="0" y="0"/>
+                      <a:ext cx="6011114" cy="1143160"/>
+                    </a:xfrm>
+                    <a:prstGeom prst="rect">
+                      <a:avLst/>
+                    </a:prstGeom>
+                    <a:ln>
+                      <a:noFill/>
+                    </a:ln>
+                    <a:extLst>
+                      <a:ext uri="{53640926-AAD7-44D8-BBD7-CCE9431645EC}">
+                        <a14:shadowObscured xmlns:a14="http://schemas.microsoft.com/office/drawing/2010/main"/>
+                      </a:ext>
+                    </a:extLst>
+                  </pic:spPr>
+                </pic:pic>
+              </a:graphicData>
+            </a:graphic>
+          </wp:inline>
+        </w:drawing>
+      </w:r>
+    </w:p>
+    <w:p>
+      <w:pPr>
+        <w:spacing w:line="360" w:lineRule="auto"/>
+        <w:jc w:val="both"/>
+        <w:rPr>
+          <w:bCs/>
+          <w:color w:val="000000" w:themeColor="text1"/>
+          <w:sz w:val="24"/>
+        </w:rPr>
+      </w:pPr>
+    </w:p>
+    <w:p>
+      <w:pPr>
+        <w:spacing w:line="360" w:lineRule="auto"/>
+        <w:jc w:val="both"/>
+        <w:rPr>
+          <w:bCs/>
+          <w:color w:val="000000" w:themeColor="text1"/>
+          <w:sz w:val="24"/>
+        </w:rPr>
+      </w:pPr>
+      <w:r>
+        <w:rPr>
+          <w:bCs/>
+          <w:color w:val="000000" w:themeColor="text1"/>
+          <w:sz w:val="24"/>
+        </w:rPr>
+        <w:t xml:space="preserve">By using </w:t>
+      </w:r>
+      <w:r>
+        <w:rPr>
+          <w:bCs/>
+          <w:color w:val="000000" w:themeColor="text1"/>
+          <w:sz w:val="24"/>
+        </w:rPr>
+        <w:t xml:space="preserve">console </w:t>
+      </w:r>
+      <w:r>
+        <w:rPr>
+          <w:bCs/>
+          <w:color w:val="000000" w:themeColor="text1"/>
+          <w:sz w:val="24"/>
+        </w:rPr>
+        <w:t>logs,</w:t>
+      </w:r>
+      <w:r>
+        <w:rPr>
+          <w:bCs/>
+          <w:color w:val="000000" w:themeColor="text1"/>
+          <w:sz w:val="24"/>
+        </w:rPr>
+        <w:t xml:space="preserve"> </w:t>
+      </w:r>
+      <w:r>
+        <w:rPr>
+          <w:bCs/>
+          <w:color w:val="000000" w:themeColor="text1"/>
+          <w:sz w:val="24"/>
+        </w:rPr>
+        <w:t>it was very</w:t>
+      </w:r>
+      <w:r>
+        <w:rPr>
+          <w:bCs/>
+          <w:color w:val="000000" w:themeColor="text1"/>
+          <w:sz w:val="24"/>
+        </w:rPr>
+        <w:t xml:space="preserve"> instrumental </w:t>
+      </w:r>
+      <w:r>
+        <w:rPr>
+          <w:bCs/>
+          <w:color w:val="000000" w:themeColor="text1"/>
+          <w:sz w:val="24"/>
+        </w:rPr>
+        <w:t>when I was</w:t>
+      </w:r>
+      <w:r>
+        <w:rPr>
+          <w:bCs/>
+          <w:color w:val="000000" w:themeColor="text1"/>
+          <w:sz w:val="24"/>
+        </w:rPr>
+        <w:t xml:space="preserve"> debugging. </w:t>
+      </w:r>
+      <w:r>
+        <w:rPr>
+          <w:bCs/>
+          <w:color w:val="000000" w:themeColor="text1"/>
+          <w:sz w:val="24"/>
+        </w:rPr>
+        <w:t xml:space="preserve">As the </w:t>
+      </w:r>
+      <w:r>
+        <w:rPr>
+          <w:bCs/>
+          <w:color w:val="000000" w:themeColor="text1"/>
+          <w:sz w:val="24"/>
+        </w:rPr>
+        <w:t>embed</w:t>
+      </w:r>
+      <w:r>
+        <w:rPr>
+          <w:bCs/>
+          <w:color w:val="000000" w:themeColor="text1"/>
+          <w:sz w:val="24"/>
+        </w:rPr>
+        <w:t>ded</w:t>
+      </w:r>
+      <w:r>
+        <w:rPr>
+          <w:bCs/>
+          <w:color w:val="000000" w:themeColor="text1"/>
+          <w:sz w:val="24"/>
+        </w:rPr>
+        <w:t xml:space="preserve"> messages like “loading image1.bmp” or “tile 3 display ON at location (10, 40)”, tracking the application's flow and diagnosing issues became considerably more </w:t>
+      </w:r>
+      <w:r>
+        <w:rPr>
+          <w:bCs/>
+          <w:color w:val="000000" w:themeColor="text1"/>
+          <w:sz w:val="24"/>
+        </w:rPr>
+        <w:t>manageable. Furthermore</w:t>
+      </w:r>
+      <w:r>
+        <w:rPr>
+          <w:bCs/>
+          <w:color w:val="000000" w:themeColor="text1"/>
+          <w:sz w:val="24"/>
+        </w:rPr>
+        <w:t xml:space="preserve">, it's important to highlight the concept of optimizing images to the current </w:t>
+      </w:r>
+      <w:r>
+        <w:rPr>
+          <w:bCs/>
+          <w:color w:val="000000" w:themeColor="text1"/>
+          <w:sz w:val="24"/>
+        </w:rPr>
+        <w:lastRenderedPageBreak/>
+        <w:t>screen's bit-depth. This optimization ensures that the rendering process is efficient, minimizing potential performance lags or visual artifacts.</w:t>
+      </w:r>
     </w:p>
     <w:sectPr>
-      <w:headerReference w:type="default" r:id="rId7"/>
+      <w:headerReference w:type="default" r:id="rId10"/>
       <w:pgSz w:w="11900" w:h="16840"/>
       <w:pgMar w:top="1440" w:right="1134" w:bottom="1440" w:left="1134" w:header="709" w:footer="709" w:gutter="0"/>
       <w:cols w:space="708"/>
@@ -1362,6 +2067,28 @@
       <w:szCs w:val="28"/>
     </w:rPr>
   </w:style>
+  <w:style w:type="paragraph" w:styleId="Heading3">
+    <w:name w:val="heading 3"/>
+    <w:basedOn w:val="Normal"/>
+    <w:next w:val="Normal"/>
+    <w:link w:val="Heading3Char"/>
+    <w:uiPriority w:val="9"/>
+    <w:semiHidden/>
+    <w:unhideWhenUsed/>
+    <w:qFormat/>
+    <w:rsid w:val="00515716"/>
+    <w:pPr>
+      <w:keepNext/>
+      <w:keepLines/>
+      <w:spacing w:before="40"/>
+      <w:outlineLvl w:val="2"/>
+    </w:pPr>
+    <w:rPr>
+      <w:rFonts w:asciiTheme="majorHAnsi" w:eastAsiaTheme="majorEastAsia" w:hAnsiTheme="majorHAnsi" w:cstheme="majorBidi"/>
+      <w:color w:val="1F4D78" w:themeColor="accent1" w:themeShade="7F"/>
+      <w:sz w:val="24"/>
+    </w:rPr>
+  </w:style>
   <w:style w:type="character" w:default="1" w:styleId="DefaultParagraphFont">
     <w:name w:val="Default Paragraph Font"/>
     <w:uiPriority w:val="1"/>
@@ -1504,6 +2231,21 @@
       <w:color w:val="44546A" w:themeColor="text2"/>
       <w:sz w:val="18"/>
       <w:szCs w:val="18"/>
+    </w:rPr>
+  </w:style>
+  <w:style w:type="character" w:customStyle="1" w:styleId="Heading3Char">
+    <w:name w:val="Heading 3 Char"/>
+    <w:basedOn w:val="DefaultParagraphFont"/>
+    <w:link w:val="Heading3"/>
+    <w:uiPriority w:val="9"/>
+    <w:semiHidden/>
+    <w:rsid w:val="00515716"/>
+    <w:rPr>
+      <w:rFonts w:asciiTheme="majorHAnsi" w:eastAsiaTheme="majorEastAsia" w:hAnsiTheme="majorHAnsi" w:cstheme="majorBidi"/>
+      <w:color w:val="1F4D78" w:themeColor="accent1" w:themeShade="7F"/>
+      <w:sz w:val="24"/>
+      <w:szCs w:val="24"/>
+      <w:lang w:eastAsia="ja-JP"/>
     </w:rPr>
   </w:style>
 </w:styles>

</xml_diff>